<commit_message>
fix(docx-extraction): add recursive OpenXML paragraph collection to support table cells and multi-column layouts
</commit_message>
<xml_diff>
--- a/backend/debug-raw-template.docx
+++ b/backend/debug-raw-template.docx
@@ -143,7 +143,7 @@
         <w:pBdr>
           <w:bottom w:val="single" w:color="2563EB" w:sz="12" w:space="4"/>
         </w:pBdr>
-        <w:spacing w:after="120" w:before="280"/>
+        <w:spacing w:after="120" w:before="260"/>
       </w:pPr>
       <w:r>
         <w:rPr w:b="" w:bCs="">
@@ -175,7 +175,7 @@
         <w:pBdr>
           <w:bottom w:val="single" w:color="2563EB" w:sz="12" w:space="4"/>
         </w:pBdr>
-        <w:spacing w:after="120" w:before="280"/>
+        <w:spacing w:after="120" w:before="260"/>
       </w:pPr>
       <w:r>
         <w:rPr w:b="" w:bCs="">
@@ -207,7 +207,7 @@
         <w:pBdr>
           <w:bottom w:val="single" w:color="2563EB" w:sz="12" w:space="4"/>
         </w:pBdr>
-        <w:spacing w:after="120" w:before="280"/>
+        <w:spacing w:after="120" w:before="260"/>
       </w:pPr>
       <w:r>
         <w:rPr w:b="" w:bCs="">
@@ -330,7 +330,7 @@
         <w:pBdr>
           <w:bottom w:val="single" w:color="2563EB" w:sz="12" w:space="4"/>
         </w:pBdr>
-        <w:spacing w:after="120" w:before="280"/>
+        <w:spacing w:after="120" w:before="260"/>
       </w:pPr>
       <w:r>
         <w:rPr w:b="" w:bCs="">
@@ -453,7 +453,7 @@
         <w:pBdr>
           <w:bottom w:val="single" w:color="2563EB" w:sz="12" w:space="4"/>
         </w:pBdr>
-        <w:spacing w:after="120" w:before="280"/>
+        <w:spacing w:after="120" w:before="260"/>
       </w:pPr>
       <w:r>
         <w:rPr w:b="" w:bCs="">
@@ -563,7 +563,7 @@
         <w:pBdr>
           <w:bottom w:val="single" w:color="2563EB" w:sz="12" w:space="4"/>
         </w:pBdr>
-        <w:spacing w:after="120" w:before="280"/>
+        <w:spacing w:after="120" w:before="260"/>
       </w:pPr>
       <w:r>
         <w:rPr w:b="" w:bCs="">
@@ -686,7 +686,7 @@
         <w:pBdr>
           <w:bottom w:val="single" w:color="2563EB" w:sz="12" w:space="4"/>
         </w:pBdr>
-        <w:spacing w:after="120" w:before="280"/>
+        <w:spacing w:after="120" w:before="260"/>
       </w:pPr>
       <w:r>
         <w:rPr w:b="" w:bCs="">

</xml_diff>